<commit_message>
nmv 13 08 2026
</commit_message>
<xml_diff>
--- a/TS-Kramam/TS-4.3/TS 4.3 Malayalam Krama Paatam Corrections.docx
+++ b/TS-Kramam/TS-4.3/TS 4.3 Malayalam Krama Paatam Corrections.docx
@@ -81,7 +81,18 @@
           <w:szCs w:val="32"/>
           <w:u w:val="single"/>
         </w:rPr>
-        <w:t xml:space="preserve">Observed till </w:t>
+        <w:t xml:space="preserve">Observed </w:t>
+      </w:r>
+      <w:proofErr w:type="gramStart"/>
+      <w:r>
+        <w:rPr>
+          <w:b/>
+          <w:bCs/>
+          <w:sz w:val="32"/>
+          <w:szCs w:val="32"/>
+          <w:u w:val="single"/>
+        </w:rPr>
+        <w:t xml:space="preserve">till </w:t>
       </w:r>
       <w:r>
         <w:rPr>
@@ -94,6 +105,7 @@
         </w:rPr>
         <w:t>????</w:t>
       </w:r>
+      <w:proofErr w:type="gramEnd"/>
     </w:p>
     <w:p>
       <w:pPr>
@@ -309,16 +321,16 @@
                 <w:b/>
                 <w:sz w:val="28"/>
                 <w:szCs w:val="32"/>
-                <w:lang w:val="it-IT"/>
-              </w:rPr>
-            </w:pPr>
-            <w:r>
-              <w:rPr>
-                <w:rFonts w:cs="Arial"/>
-                <w:b/>
-                <w:sz w:val="28"/>
-                <w:szCs w:val="32"/>
-                <w:lang w:val="it-IT"/>
+                <w:lang w:val="en-IN"/>
+              </w:rPr>
+            </w:pPr>
+            <w:r>
+              <w:rPr>
+                <w:rFonts w:cs="Arial"/>
+                <w:b/>
+                <w:sz w:val="28"/>
+                <w:szCs w:val="32"/>
+                <w:lang w:val="en-IN"/>
               </w:rPr>
               <w:t xml:space="preserve">Krama Vaakyam No.– </w:t>
             </w:r>
@@ -328,7 +340,7 @@
                 <w:b/>
                 <w:sz w:val="28"/>
                 <w:szCs w:val="32"/>
-                <w:lang w:val="it-IT"/>
+                <w:lang w:val="en-IN"/>
               </w:rPr>
               <w:t>12</w:t>
             </w:r>
@@ -405,14 +417,16 @@
                 <w:color w:val="000000"/>
                 <w:sz w:val="40"/>
                 <w:szCs w:val="40"/>
-              </w:rPr>
-            </w:pPr>
-            <w:r>
-              <w:rPr>
-                <w:rFonts w:ascii="BRH Malayalam Extra" w:hAnsi="BRH Malayalam Extra" w:cs="BRH Malayalam Extra"/>
-                <w:color w:val="000000"/>
-                <w:sz w:val="40"/>
-                <w:szCs w:val="40"/>
+                <w:lang w:val="it-IT"/>
+              </w:rPr>
+            </w:pPr>
+            <w:r>
+              <w:rPr>
+                <w:rFonts w:ascii="BRH Malayalam Extra" w:hAnsi="BRH Malayalam Extra" w:cs="BRH Malayalam Extra"/>
+                <w:color w:val="000000"/>
+                <w:sz w:val="40"/>
+                <w:szCs w:val="40"/>
+                <w:lang w:val="it-IT"/>
               </w:rPr>
               <w:t>D</w:t>
             </w:r>
@@ -423,6 +437,7 @@
                 <w:sz w:val="40"/>
                 <w:szCs w:val="40"/>
                 <w:highlight w:val="yellow"/>
+                <w:lang w:val="it-IT"/>
               </w:rPr>
               <w:t>±</w:t>
             </w:r>
@@ -432,6 +447,7 @@
                 <w:color w:val="000000"/>
                 <w:sz w:val="40"/>
                 <w:szCs w:val="40"/>
+                <w:lang w:val="it-IT"/>
               </w:rPr>
               <w:t>—sõ ¥K</w:t>
             </w:r>
@@ -441,35 +457,19 @@
                 <w:color w:val="000000"/>
                 <w:sz w:val="32"/>
                 <w:szCs w:val="40"/>
-              </w:rPr>
-              <w:t>–</w:t>
-            </w:r>
-            <w:r>
-              <w:rPr>
-                <w:rFonts w:ascii="BRH Malayalam Extra" w:hAnsi="BRH Malayalam Extra" w:cs="BRH Malayalam Extra"/>
-                <w:color w:val="000000"/>
-                <w:sz w:val="40"/>
-                <w:szCs w:val="40"/>
-              </w:rPr>
-              <w:t>Z¡</w:t>
-            </w:r>
-            <w:r>
-              <w:rPr>
-                <w:rFonts w:ascii="BRH Malayalam Extra" w:hAnsi="BRH Malayalam Extra" w:cs="BRH Malayalam Extra"/>
-                <w:color w:val="000000"/>
-                <w:sz w:val="40"/>
-                <w:szCs w:val="40"/>
-              </w:rPr>
-              <w:t>I</w:t>
-            </w:r>
-            <w:r>
-              <w:rPr>
-                <w:rFonts w:ascii="BRH Malayalam Extra" w:hAnsi="BRH Malayalam Extra" w:cs="BRH Malayalam Extra"/>
-                <w:color w:val="000000"/>
-                <w:sz w:val="40"/>
-                <w:szCs w:val="40"/>
-              </w:rPr>
-              <w:t xml:space="preserve"> | </w:t>
+                <w:lang w:val="it-IT"/>
+              </w:rPr>
+              <w:t>–</w:t>
+            </w:r>
+            <w:r>
+              <w:rPr>
+                <w:rFonts w:ascii="BRH Malayalam Extra" w:hAnsi="BRH Malayalam Extra" w:cs="BRH Malayalam Extra"/>
+                <w:color w:val="000000"/>
+                <w:sz w:val="40"/>
+                <w:szCs w:val="40"/>
+                <w:lang w:val="it-IT"/>
+              </w:rPr>
+              <w:t xml:space="preserve">Z¡I | </w:t>
             </w:r>
           </w:p>
           <w:p>
@@ -484,14 +484,16 @@
                 <w:color w:val="000000"/>
                 <w:sz w:val="40"/>
                 <w:szCs w:val="40"/>
-              </w:rPr>
-            </w:pPr>
-            <w:r>
-              <w:rPr>
-                <w:rFonts w:ascii="BRH Malayalam Extra" w:hAnsi="BRH Malayalam Extra" w:cs="BRH Malayalam Extra"/>
-                <w:color w:val="000000"/>
-                <w:sz w:val="40"/>
-                <w:szCs w:val="40"/>
+                <w:lang w:val="it-IT"/>
+              </w:rPr>
+            </w:pPr>
+            <w:r>
+              <w:rPr>
+                <w:rFonts w:ascii="BRH Malayalam Extra" w:hAnsi="BRH Malayalam Extra" w:cs="BRH Malayalam Extra"/>
+                <w:color w:val="000000"/>
+                <w:sz w:val="40"/>
+                <w:szCs w:val="40"/>
+                <w:lang w:val="it-IT"/>
               </w:rPr>
               <w:t>¥K</w:t>
             </w:r>
@@ -501,71 +503,39 @@
                 <w:color w:val="000000"/>
                 <w:sz w:val="32"/>
                 <w:szCs w:val="40"/>
-              </w:rPr>
-              <w:t>–</w:t>
-            </w:r>
-            <w:r>
-              <w:rPr>
-                <w:rFonts w:ascii="BRH Malayalam Extra" w:hAnsi="BRH Malayalam Extra" w:cs="BRH Malayalam Extra"/>
-                <w:color w:val="000000"/>
-                <w:sz w:val="40"/>
-                <w:szCs w:val="40"/>
-              </w:rPr>
-              <w:t>Z¡</w:t>
-            </w:r>
-            <w:r>
-              <w:rPr>
-                <w:rFonts w:ascii="BRH Malayalam Extra" w:hAnsi="BRH Malayalam Extra" w:cs="BRH Malayalam Extra"/>
-                <w:color w:val="000000"/>
-                <w:sz w:val="40"/>
-                <w:szCs w:val="40"/>
-              </w:rPr>
-              <w:t>I</w:t>
-            </w:r>
-            <w:r>
-              <w:rPr>
-                <w:rFonts w:ascii="BRH Malayalam Extra" w:hAnsi="BRH Malayalam Extra" w:cs="BRH Malayalam Extra"/>
-                <w:color w:val="000000"/>
-                <w:sz w:val="40"/>
-                <w:szCs w:val="40"/>
-              </w:rPr>
-              <w:t xml:space="preserve"> öe—a</w:t>
-            </w:r>
-            <w:r>
-              <w:rPr>
-                <w:rFonts w:ascii="BRH Malayalam Extra" w:hAnsi="BRH Malayalam Extra" w:cs="BRH Malayalam Extra"/>
-                <w:color w:val="000000"/>
-                <w:sz w:val="32"/>
-                <w:szCs w:val="40"/>
-              </w:rPr>
-              <w:t>–</w:t>
-            </w:r>
-            <w:r>
-              <w:rPr>
-                <w:rFonts w:ascii="BRH Malayalam Extra" w:hAnsi="BRH Malayalam Extra" w:cs="BRH Malayalam Extra"/>
-                <w:color w:val="000000"/>
-                <w:sz w:val="40"/>
-                <w:szCs w:val="40"/>
-              </w:rPr>
-              <w:t>i</w:t>
-            </w:r>
-            <w:r>
-              <w:rPr>
-                <w:rFonts w:ascii="BRH Malayalam Extra" w:hAnsi="BRH Malayalam Extra" w:cs="BRH Malayalam Extra"/>
-                <w:color w:val="000000"/>
-                <w:sz w:val="40"/>
-                <w:szCs w:val="40"/>
-              </w:rPr>
-              <w:t>I</w:t>
-            </w:r>
-            <w:r>
-              <w:rPr>
-                <w:rFonts w:ascii="BRH Malayalam Extra" w:hAnsi="BRH Malayalam Extra" w:cs="BRH Malayalam Extra"/>
-                <w:color w:val="000000"/>
-                <w:sz w:val="40"/>
-                <w:szCs w:val="40"/>
-              </w:rPr>
-              <w:t xml:space="preserve"> |</w:t>
+                <w:lang w:val="it-IT"/>
+              </w:rPr>
+              <w:t>–</w:t>
+            </w:r>
+            <w:r>
+              <w:rPr>
+                <w:rFonts w:ascii="BRH Malayalam Extra" w:hAnsi="BRH Malayalam Extra" w:cs="BRH Malayalam Extra"/>
+                <w:color w:val="000000"/>
+                <w:sz w:val="40"/>
+                <w:szCs w:val="40"/>
+                <w:lang w:val="it-IT"/>
+              </w:rPr>
+              <w:t>Z¡I öe—a</w:t>
+            </w:r>
+            <w:r>
+              <w:rPr>
+                <w:rFonts w:ascii="BRH Malayalam Extra" w:hAnsi="BRH Malayalam Extra" w:cs="BRH Malayalam Extra"/>
+                <w:color w:val="000000"/>
+                <w:sz w:val="32"/>
+                <w:szCs w:val="40"/>
+                <w:lang w:val="it-IT"/>
+              </w:rPr>
+              <w:t>–</w:t>
+            </w:r>
+            <w:r>
+              <w:rPr>
+                <w:rFonts w:ascii="BRH Malayalam Extra" w:hAnsi="BRH Malayalam Extra" w:cs="BRH Malayalam Extra"/>
+                <w:color w:val="000000"/>
+                <w:sz w:val="40"/>
+                <w:szCs w:val="40"/>
+                <w:lang w:val="it-IT"/>
+              </w:rPr>
+              <w:t>iI |</w:t>
             </w:r>
           </w:p>
         </w:tc>
@@ -591,14 +561,16 @@
                 <w:color w:val="000000"/>
                 <w:sz w:val="40"/>
                 <w:szCs w:val="40"/>
-              </w:rPr>
-            </w:pPr>
-            <w:r>
-              <w:rPr>
-                <w:rFonts w:ascii="BRH Malayalam Extra" w:hAnsi="BRH Malayalam Extra" w:cs="BRH Malayalam Extra"/>
-                <w:color w:val="000000"/>
-                <w:sz w:val="40"/>
-                <w:szCs w:val="40"/>
+                <w:lang w:val="it-IT"/>
+              </w:rPr>
+            </w:pPr>
+            <w:r>
+              <w:rPr>
+                <w:rFonts w:ascii="BRH Malayalam Extra" w:hAnsi="BRH Malayalam Extra" w:cs="BRH Malayalam Extra"/>
+                <w:color w:val="000000"/>
+                <w:sz w:val="40"/>
+                <w:szCs w:val="40"/>
+                <w:lang w:val="it-IT"/>
               </w:rPr>
               <w:t>D</w:t>
             </w:r>
@@ -608,6 +580,7 @@
                 <w:sz w:val="40"/>
                 <w:szCs w:val="40"/>
                 <w:highlight w:val="green"/>
+                <w:lang w:val="it-IT"/>
               </w:rPr>
               <w:t>Lõ</w:t>
             </w:r>
@@ -617,6 +590,7 @@
                 <w:color w:val="000000"/>
                 <w:sz w:val="40"/>
                 <w:szCs w:val="40"/>
+                <w:lang w:val="it-IT"/>
               </w:rPr>
               <w:t>—sõ ¥K</w:t>
             </w:r>
@@ -626,17 +600,915 @@
                 <w:color w:val="000000"/>
                 <w:sz w:val="32"/>
                 <w:szCs w:val="40"/>
-              </w:rPr>
-              <w:t>–</w:t>
-            </w:r>
-            <w:r>
-              <w:rPr>
-                <w:rFonts w:ascii="BRH Malayalam Extra" w:hAnsi="BRH Malayalam Extra" w:cs="BRH Malayalam Extra"/>
-                <w:color w:val="000000"/>
-                <w:sz w:val="40"/>
-                <w:szCs w:val="40"/>
-              </w:rPr>
-              <w:t>Z¡</w:t>
+                <w:lang w:val="it-IT"/>
+              </w:rPr>
+              <w:t>–</w:t>
+            </w:r>
+            <w:r>
+              <w:rPr>
+                <w:rFonts w:ascii="BRH Malayalam Extra" w:hAnsi="BRH Malayalam Extra" w:cs="BRH Malayalam Extra"/>
+                <w:color w:val="000000"/>
+                <w:sz w:val="40"/>
+                <w:szCs w:val="40"/>
+                <w:lang w:val="it-IT"/>
+              </w:rPr>
+              <w:t xml:space="preserve">Z¡I | </w:t>
+            </w:r>
+          </w:p>
+          <w:p>
+            <w:pPr>
+              <w:widowControl w:val="0"/>
+              <w:autoSpaceDE w:val="0"/>
+              <w:autoSpaceDN w:val="0"/>
+              <w:adjustRightInd w:val="0"/>
+              <w:spacing w:before="0" w:line="240" w:lineRule="auto"/>
+              <w:rPr>
+                <w:rFonts w:ascii="BRH Malayalam Extra" w:hAnsi="BRH Malayalam Extra" w:cs="BRH Malayalam Extra"/>
+                <w:color w:val="000000"/>
+                <w:sz w:val="40"/>
+                <w:szCs w:val="40"/>
+                <w:lang w:val="it-IT"/>
+              </w:rPr>
+            </w:pPr>
+            <w:r>
+              <w:rPr>
+                <w:rFonts w:ascii="BRH Malayalam Extra" w:hAnsi="BRH Malayalam Extra" w:cs="BRH Malayalam Extra"/>
+                <w:color w:val="000000"/>
+                <w:sz w:val="40"/>
+                <w:szCs w:val="40"/>
+                <w:lang w:val="it-IT"/>
+              </w:rPr>
+              <w:t>¥K</w:t>
+            </w:r>
+            <w:r>
+              <w:rPr>
+                <w:rFonts w:ascii="BRH Malayalam Extra" w:hAnsi="BRH Malayalam Extra" w:cs="BRH Malayalam Extra"/>
+                <w:color w:val="000000"/>
+                <w:sz w:val="32"/>
+                <w:szCs w:val="40"/>
+                <w:lang w:val="it-IT"/>
+              </w:rPr>
+              <w:t>–</w:t>
+            </w:r>
+            <w:r>
+              <w:rPr>
+                <w:rFonts w:ascii="BRH Malayalam Extra" w:hAnsi="BRH Malayalam Extra" w:cs="BRH Malayalam Extra"/>
+                <w:color w:val="000000"/>
+                <w:sz w:val="40"/>
+                <w:szCs w:val="40"/>
+                <w:lang w:val="it-IT"/>
+              </w:rPr>
+              <w:t>Z¡I öe—a</w:t>
+            </w:r>
+            <w:r>
+              <w:rPr>
+                <w:rFonts w:ascii="BRH Malayalam Extra" w:hAnsi="BRH Malayalam Extra" w:cs="BRH Malayalam Extra"/>
+                <w:color w:val="000000"/>
+                <w:sz w:val="32"/>
+                <w:szCs w:val="40"/>
+                <w:lang w:val="it-IT"/>
+              </w:rPr>
+              <w:t>–</w:t>
+            </w:r>
+            <w:r>
+              <w:rPr>
+                <w:rFonts w:ascii="BRH Malayalam Extra" w:hAnsi="BRH Malayalam Extra" w:cs="BRH Malayalam Extra"/>
+                <w:color w:val="000000"/>
+                <w:sz w:val="40"/>
+                <w:szCs w:val="40"/>
+                <w:lang w:val="it-IT"/>
+              </w:rPr>
+              <w:t>iI |</w:t>
+            </w:r>
+          </w:p>
+        </w:tc>
+      </w:tr>
+      <w:tr>
+        <w:trPr>
+          <w:trHeight w:val="1563"/>
+        </w:trPr>
+        <w:tc>
+          <w:tcPr>
+            <w:tcW w:w="3906" w:type="dxa"/>
+            <w:tcBorders>
+              <w:top w:val="single" w:sz="4" w:space="0" w:color="000000"/>
+              <w:left w:val="single" w:sz="4" w:space="0" w:color="000000"/>
+              <w:bottom w:val="single" w:sz="4" w:space="0" w:color="000000"/>
+              <w:right w:val="single" w:sz="4" w:space="0" w:color="000000"/>
+            </w:tcBorders>
+          </w:tcPr>
+          <w:p>
+            <w:pPr>
+              <w:widowControl w:val="0"/>
+              <w:tabs>
+                <w:tab w:val="left" w:pos="993"/>
+              </w:tabs>
+              <w:autoSpaceDE w:val="0"/>
+              <w:autoSpaceDN w:val="0"/>
+              <w:adjustRightInd w:val="0"/>
+              <w:spacing w:before="0" w:line="240" w:lineRule="auto"/>
+              <w:ind w:right="297"/>
+              <w:rPr>
+                <w:rFonts w:cs="Arial"/>
+                <w:b/>
+                <w:sz w:val="28"/>
+                <w:szCs w:val="32"/>
+              </w:rPr>
+            </w:pPr>
+            <w:r>
+              <w:rPr>
+                <w:rFonts w:cs="Arial"/>
+                <w:b/>
+                <w:sz w:val="28"/>
+                <w:szCs w:val="32"/>
+              </w:rPr>
+              <w:t>T.S.4.3.</w:t>
+            </w:r>
+            <w:r>
+              <w:rPr>
+                <w:rFonts w:cs="Arial"/>
+                <w:b/>
+                <w:sz w:val="28"/>
+                <w:szCs w:val="32"/>
+              </w:rPr>
+              <w:t>10</w:t>
+            </w:r>
+            <w:r>
+              <w:rPr>
+                <w:rFonts w:cs="Arial"/>
+                <w:b/>
+                <w:sz w:val="28"/>
+                <w:szCs w:val="32"/>
+              </w:rPr>
+              <w:t>.</w:t>
+            </w:r>
+            <w:r>
+              <w:rPr>
+                <w:rFonts w:cs="Arial"/>
+                <w:b/>
+                <w:sz w:val="28"/>
+                <w:szCs w:val="32"/>
+              </w:rPr>
+              <w:t>3</w:t>
+            </w:r>
+            <w:r>
+              <w:rPr>
+                <w:rFonts w:cs="Arial"/>
+                <w:b/>
+                <w:sz w:val="28"/>
+                <w:szCs w:val="32"/>
+              </w:rPr>
+              <w:t xml:space="preserve"> – Kramam</w:t>
+            </w:r>
+          </w:p>
+          <w:p>
+            <w:pPr>
+              <w:widowControl w:val="0"/>
+              <w:tabs>
+                <w:tab w:val="left" w:pos="993"/>
+              </w:tabs>
+              <w:autoSpaceDE w:val="0"/>
+              <w:autoSpaceDN w:val="0"/>
+              <w:adjustRightInd w:val="0"/>
+              <w:spacing w:before="0" w:line="240" w:lineRule="auto"/>
+              <w:ind w:right="297"/>
+              <w:rPr>
+                <w:rFonts w:cs="Arial"/>
+                <w:b/>
+                <w:sz w:val="28"/>
+                <w:szCs w:val="32"/>
+                <w:lang w:val="it-IT"/>
+              </w:rPr>
+            </w:pPr>
+            <w:r>
+              <w:rPr>
+                <w:rFonts w:cs="Arial"/>
+                <w:b/>
+                <w:sz w:val="28"/>
+                <w:szCs w:val="32"/>
+                <w:lang w:val="it-IT"/>
+              </w:rPr>
+              <w:t xml:space="preserve">Krama Vaakyam No.– </w:t>
+            </w:r>
+            <w:r>
+              <w:rPr>
+                <w:rFonts w:cs="Arial"/>
+                <w:b/>
+                <w:sz w:val="28"/>
+                <w:szCs w:val="32"/>
+                <w:lang w:val="it-IT"/>
+              </w:rPr>
+              <w:t>20</w:t>
+            </w:r>
+          </w:p>
+          <w:p>
+            <w:pPr>
+              <w:widowControl w:val="0"/>
+              <w:tabs>
+                <w:tab w:val="left" w:pos="993"/>
+              </w:tabs>
+              <w:autoSpaceDE w:val="0"/>
+              <w:autoSpaceDN w:val="0"/>
+              <w:adjustRightInd w:val="0"/>
+              <w:spacing w:before="0" w:line="240" w:lineRule="auto"/>
+              <w:ind w:right="297"/>
+              <w:rPr>
+                <w:rFonts w:cs="Arial"/>
+                <w:b/>
+                <w:sz w:val="28"/>
+                <w:szCs w:val="32"/>
+                <w:lang w:val="it-IT"/>
+              </w:rPr>
+            </w:pPr>
+            <w:r>
+              <w:rPr>
+                <w:rFonts w:cs="Arial"/>
+                <w:b/>
+                <w:sz w:val="28"/>
+                <w:szCs w:val="32"/>
+                <w:lang w:val="it-IT"/>
+              </w:rPr>
+              <w:t>Panchaati No</w:t>
+            </w:r>
+            <w:r>
+              <w:rPr>
+                <w:rFonts w:cs="Arial"/>
+                <w:b/>
+                <w:szCs w:val="32"/>
+                <w:lang w:val="it-IT"/>
+              </w:rPr>
+              <w:t xml:space="preserve">. - </w:t>
+            </w:r>
+            <w:r>
+              <w:rPr>
+                <w:rFonts w:cs="Arial"/>
+                <w:b/>
+                <w:sz w:val="28"/>
+                <w:szCs w:val="32"/>
+                <w:lang w:val="it-IT"/>
+              </w:rPr>
+              <w:t>20</w:t>
+            </w:r>
+          </w:p>
+        </w:tc>
+        <w:tc>
+          <w:tcPr>
+            <w:tcW w:w="5103" w:type="dxa"/>
+            <w:tcBorders>
+              <w:top w:val="single" w:sz="4" w:space="0" w:color="000000"/>
+              <w:left w:val="single" w:sz="4" w:space="0" w:color="000000"/>
+              <w:bottom w:val="single" w:sz="4" w:space="0" w:color="000000"/>
+              <w:right w:val="single" w:sz="4" w:space="0" w:color="000000"/>
+            </w:tcBorders>
+          </w:tcPr>
+          <w:p>
+            <w:pPr>
+              <w:widowControl w:val="0"/>
+              <w:autoSpaceDE w:val="0"/>
+              <w:autoSpaceDN w:val="0"/>
+              <w:adjustRightInd w:val="0"/>
+              <w:spacing w:before="0" w:line="240" w:lineRule="auto"/>
+              <w:rPr>
+                <w:rFonts w:ascii="BRH Malayalam Extra" w:hAnsi="BRH Malayalam Extra" w:cs="BRH Malayalam Extra"/>
+                <w:color w:val="000000"/>
+                <w:sz w:val="40"/>
+                <w:szCs w:val="40"/>
+              </w:rPr>
+            </w:pPr>
+            <w:r>
+              <w:rPr>
+                <w:rFonts w:ascii="BRH Malayalam Extra" w:hAnsi="BRH Malayalam Extra" w:cs="BRH Malayalam Extra"/>
+                <w:color w:val="000000"/>
+                <w:sz w:val="40"/>
+                <w:szCs w:val="40"/>
+              </w:rPr>
+              <w:t>Acy—eZy</w:t>
+            </w:r>
+            <w:r>
+              <w:rPr>
+                <w:rFonts w:ascii="BRH Malayalam Extra" w:hAnsi="BRH Malayalam Extra" w:cs="BRH Malayalam Extra"/>
+                <w:color w:val="000000"/>
+                <w:sz w:val="32"/>
+                <w:szCs w:val="40"/>
+              </w:rPr>
+              <w:t>–</w:t>
+            </w:r>
+            <w:r>
+              <w:rPr>
+                <w:rFonts w:ascii="BRH Malayalam Extra" w:hAnsi="BRH Malayalam Extra" w:cs="BRH Malayalam Extra"/>
+                <w:color w:val="000000"/>
+                <w:sz w:val="40"/>
+                <w:szCs w:val="40"/>
+              </w:rPr>
+              <w:t>kZõcy— - e</w:t>
+            </w:r>
+            <w:r>
+              <w:rPr>
+                <w:rFonts w:ascii="BRH Malayalam Extra" w:hAnsi="BRH Malayalam Extra" w:cs="BRH Malayalam Extra"/>
+                <w:color w:val="000000"/>
+                <w:sz w:val="32"/>
+                <w:szCs w:val="40"/>
+              </w:rPr>
+              <w:t>–</w:t>
+            </w:r>
+            <w:r>
+              <w:rPr>
+                <w:rFonts w:ascii="BRH Malayalam Extra" w:hAnsi="BRH Malayalam Extra" w:cs="BRH Malayalam Extra"/>
+                <w:color w:val="000000"/>
+                <w:sz w:val="40"/>
+                <w:szCs w:val="40"/>
+              </w:rPr>
+              <w:t>Zy</w:t>
+            </w:r>
+            <w:r>
+              <w:rPr>
+                <w:rFonts w:ascii="BRH Malayalam Extra" w:hAnsi="BRH Malayalam Extra" w:cs="BRH Malayalam Extra"/>
+                <w:color w:val="000000"/>
+                <w:sz w:val="32"/>
+                <w:szCs w:val="40"/>
+              </w:rPr>
+              <w:t>–</w:t>
+            </w:r>
+            <w:r>
+              <w:rPr>
+                <w:rFonts w:ascii="BRH Malayalam Extra" w:hAnsi="BRH Malayalam Extra" w:cs="BRH Malayalam Extra"/>
+                <w:color w:val="000000"/>
+                <w:sz w:val="40"/>
+                <w:szCs w:val="40"/>
+              </w:rPr>
+              <w:t>J | B</w:t>
+            </w:r>
+            <w:r>
+              <w:rPr>
+                <w:rFonts w:ascii="BRH Malayalam Extra" w:hAnsi="BRH Malayalam Extra" w:cs="BRH Malayalam Extra"/>
+                <w:color w:val="000000"/>
+                <w:sz w:val="32"/>
+                <w:szCs w:val="40"/>
+              </w:rPr>
+              <w:t>–</w:t>
+            </w:r>
+            <w:r>
+              <w:rPr>
+                <w:rFonts w:ascii="BRH Malayalam Extra" w:hAnsi="BRH Malayalam Extra" w:cs="BRH Malayalam Extra"/>
+                <w:color w:val="000000"/>
+                <w:sz w:val="40"/>
+                <w:szCs w:val="40"/>
+              </w:rPr>
+              <w:t>sz</w:t>
+            </w:r>
+            <w:r>
+              <w:rPr>
+                <w:rFonts w:ascii="BRH Malayalam Extra" w:hAnsi="BRH Malayalam Extra" w:cs="BRH Malayalam Extra"/>
+                <w:color w:val="000000"/>
+                <w:sz w:val="32"/>
+                <w:szCs w:val="40"/>
+              </w:rPr>
+              <w:t>–</w:t>
+            </w:r>
+            <w:r>
+              <w:rPr>
+                <w:rFonts w:ascii="BRH Malayalam Extra" w:hAnsi="BRH Malayalam Extra" w:cs="BRH Malayalam Extra"/>
+                <w:color w:val="000000"/>
+                <w:sz w:val="40"/>
+                <w:szCs w:val="40"/>
+              </w:rPr>
+              <w:t>¥bK—öZy</w:t>
+            </w:r>
+            <w:r>
+              <w:rPr>
+                <w:rFonts w:ascii="BRH Devanagari Extra" w:hAnsi="BRH Devanagari Extra" w:cs="BRH Malayalam Extra"/>
+                <w:color w:val="000000"/>
+                <w:sz w:val="36"/>
+                <w:szCs w:val="40"/>
+              </w:rPr>
+              <w:t>óè</w:t>
+            </w:r>
+            <w:r>
+              <w:rPr>
+                <w:rFonts w:ascii="BRH Malayalam Extra" w:hAnsi="BRH Malayalam Extra" w:cs="BRH Malayalam Extra"/>
+                <w:color w:val="000000"/>
+                <w:sz w:val="40"/>
+                <w:szCs w:val="40"/>
+              </w:rPr>
+              <w:t>q</w:t>
+            </w:r>
+            <w:r>
+              <w:rPr>
+                <w:rFonts w:ascii="BRH Malayalam Extra" w:hAnsi="BRH Malayalam Extra" w:cs="BRH Malayalam Extra"/>
+                <w:color w:val="000000"/>
+                <w:sz w:val="40"/>
+                <w:szCs w:val="40"/>
+                <w:highlight w:val="yellow"/>
+              </w:rPr>
+              <w:t>Zx</w:t>
+            </w:r>
+            <w:r>
+              <w:rPr>
+                <w:rFonts w:ascii="BRH Malayalam Extra" w:hAnsi="BRH Malayalam Extra" w:cs="BRH Malayalam Extra"/>
+                <w:color w:val="000000"/>
+                <w:sz w:val="32"/>
+                <w:szCs w:val="40"/>
+                <w:highlight w:val="yellow"/>
+              </w:rPr>
+              <w:t>–</w:t>
+            </w:r>
+            <w:r>
+              <w:rPr>
+                <w:rFonts w:ascii="BRH Malayalam Extra" w:hAnsi="BRH Malayalam Extra" w:cs="BRH Malayalam Extra"/>
+                <w:color w:val="000000"/>
+                <w:sz w:val="40"/>
+                <w:szCs w:val="40"/>
+                <w:highlight w:val="yellow"/>
+              </w:rPr>
+              <w:t>J</w:t>
+            </w:r>
+            <w:r>
+              <w:rPr>
+                <w:rFonts w:ascii="BRH Malayalam Extra" w:hAnsi="BRH Malayalam Extra" w:cs="BRH Malayalam Extra"/>
+                <w:color w:val="000000"/>
+                <w:sz w:val="40"/>
+                <w:szCs w:val="40"/>
+              </w:rPr>
+              <w:t xml:space="preserve"> |</w:t>
+            </w:r>
+          </w:p>
+        </w:tc>
+        <w:tc>
+          <w:tcPr>
+            <w:tcW w:w="5386" w:type="dxa"/>
+            <w:tcBorders>
+              <w:top w:val="single" w:sz="4" w:space="0" w:color="000000"/>
+              <w:left w:val="single" w:sz="4" w:space="0" w:color="000000"/>
+              <w:bottom w:val="single" w:sz="4" w:space="0" w:color="000000"/>
+              <w:right w:val="single" w:sz="4" w:space="0" w:color="000000"/>
+            </w:tcBorders>
+          </w:tcPr>
+          <w:p>
+            <w:pPr>
+              <w:widowControl w:val="0"/>
+              <w:autoSpaceDE w:val="0"/>
+              <w:autoSpaceDN w:val="0"/>
+              <w:adjustRightInd w:val="0"/>
+              <w:spacing w:before="0" w:line="240" w:lineRule="auto"/>
+              <w:rPr>
+                <w:rFonts w:ascii="BRH Malayalam Extra" w:hAnsi="BRH Malayalam Extra" w:cs="BRH Malayalam Extra"/>
+                <w:color w:val="000000"/>
+                <w:sz w:val="40"/>
+                <w:szCs w:val="40"/>
+              </w:rPr>
+            </w:pPr>
+            <w:r>
+              <w:rPr>
+                <w:rFonts w:ascii="BRH Malayalam Extra" w:hAnsi="BRH Malayalam Extra" w:cs="BRH Malayalam Extra"/>
+                <w:color w:val="000000"/>
+                <w:sz w:val="40"/>
+                <w:szCs w:val="40"/>
+              </w:rPr>
+              <w:t>Acy—eZy</w:t>
+            </w:r>
+            <w:r>
+              <w:rPr>
+                <w:rFonts w:ascii="BRH Malayalam Extra" w:hAnsi="BRH Malayalam Extra" w:cs="BRH Malayalam Extra"/>
+                <w:color w:val="000000"/>
+                <w:sz w:val="32"/>
+                <w:szCs w:val="40"/>
+              </w:rPr>
+              <w:t>–</w:t>
+            </w:r>
+            <w:r>
+              <w:rPr>
+                <w:rFonts w:ascii="BRH Malayalam Extra" w:hAnsi="BRH Malayalam Extra" w:cs="BRH Malayalam Extra"/>
+                <w:color w:val="000000"/>
+                <w:sz w:val="40"/>
+                <w:szCs w:val="40"/>
+              </w:rPr>
+              <w:t>kZõcy— - e</w:t>
+            </w:r>
+            <w:r>
+              <w:rPr>
+                <w:rFonts w:ascii="BRH Malayalam Extra" w:hAnsi="BRH Malayalam Extra" w:cs="BRH Malayalam Extra"/>
+                <w:color w:val="000000"/>
+                <w:sz w:val="32"/>
+                <w:szCs w:val="40"/>
+              </w:rPr>
+              <w:t>–</w:t>
+            </w:r>
+            <w:r>
+              <w:rPr>
+                <w:rFonts w:ascii="BRH Malayalam Extra" w:hAnsi="BRH Malayalam Extra" w:cs="BRH Malayalam Extra"/>
+                <w:color w:val="000000"/>
+                <w:sz w:val="40"/>
+                <w:szCs w:val="40"/>
+              </w:rPr>
+              <w:t>Zy</w:t>
+            </w:r>
+            <w:r>
+              <w:rPr>
+                <w:rFonts w:ascii="BRH Malayalam Extra" w:hAnsi="BRH Malayalam Extra" w:cs="BRH Malayalam Extra"/>
+                <w:color w:val="000000"/>
+                <w:sz w:val="32"/>
+                <w:szCs w:val="40"/>
+              </w:rPr>
+              <w:t>–</w:t>
+            </w:r>
+            <w:r>
+              <w:rPr>
+                <w:rFonts w:ascii="BRH Malayalam Extra" w:hAnsi="BRH Malayalam Extra" w:cs="BRH Malayalam Extra"/>
+                <w:color w:val="000000"/>
+                <w:sz w:val="40"/>
+                <w:szCs w:val="40"/>
+              </w:rPr>
+              <w:t xml:space="preserve">J | </w:t>
+            </w:r>
+          </w:p>
+          <w:p>
+            <w:pPr>
+              <w:widowControl w:val="0"/>
+              <w:autoSpaceDE w:val="0"/>
+              <w:autoSpaceDN w:val="0"/>
+              <w:adjustRightInd w:val="0"/>
+              <w:spacing w:before="0" w:line="240" w:lineRule="auto"/>
+              <w:rPr>
+                <w:rFonts w:ascii="BRH Malayalam Extra" w:hAnsi="BRH Malayalam Extra" w:cs="BRH Malayalam Extra"/>
+                <w:color w:val="000000"/>
+                <w:sz w:val="40"/>
+                <w:szCs w:val="40"/>
+              </w:rPr>
+            </w:pPr>
+            <w:r>
+              <w:rPr>
+                <w:rFonts w:ascii="BRH Malayalam Extra" w:hAnsi="BRH Malayalam Extra" w:cs="BRH Malayalam Extra"/>
+                <w:color w:val="000000"/>
+                <w:sz w:val="40"/>
+                <w:szCs w:val="40"/>
+              </w:rPr>
+              <w:t>B</w:t>
+            </w:r>
+            <w:r>
+              <w:rPr>
+                <w:rFonts w:ascii="BRH Malayalam Extra" w:hAnsi="BRH Malayalam Extra" w:cs="BRH Malayalam Extra"/>
+                <w:color w:val="000000"/>
+                <w:sz w:val="32"/>
+                <w:szCs w:val="40"/>
+              </w:rPr>
+              <w:t>–</w:t>
+            </w:r>
+            <w:r>
+              <w:rPr>
+                <w:rFonts w:ascii="BRH Malayalam Extra" w:hAnsi="BRH Malayalam Extra" w:cs="BRH Malayalam Extra"/>
+                <w:color w:val="000000"/>
+                <w:sz w:val="40"/>
+                <w:szCs w:val="40"/>
+              </w:rPr>
+              <w:t>sz</w:t>
+            </w:r>
+            <w:r>
+              <w:rPr>
+                <w:rFonts w:ascii="BRH Malayalam Extra" w:hAnsi="BRH Malayalam Extra" w:cs="BRH Malayalam Extra"/>
+                <w:color w:val="000000"/>
+                <w:sz w:val="32"/>
+                <w:szCs w:val="40"/>
+              </w:rPr>
+              <w:t>–</w:t>
+            </w:r>
+            <w:r>
+              <w:rPr>
+                <w:rFonts w:ascii="BRH Malayalam Extra" w:hAnsi="BRH Malayalam Extra" w:cs="BRH Malayalam Extra"/>
+                <w:color w:val="000000"/>
+                <w:sz w:val="40"/>
+                <w:szCs w:val="40"/>
+              </w:rPr>
+              <w:t>¥bK—öZy</w:t>
+            </w:r>
+            <w:r>
+              <w:rPr>
+                <w:rFonts w:ascii="BRH Devanagari Extra" w:hAnsi="BRH Devanagari Extra" w:cs="BRH Malayalam Extra"/>
+                <w:color w:val="000000"/>
+                <w:sz w:val="36"/>
+                <w:szCs w:val="40"/>
+              </w:rPr>
+              <w:t>óè</w:t>
+            </w:r>
+            <w:r>
+              <w:rPr>
+                <w:rFonts w:ascii="BRH Malayalam Extra" w:hAnsi="BRH Malayalam Extra" w:cs="BRH Malayalam Extra"/>
+                <w:color w:val="000000"/>
+                <w:sz w:val="40"/>
+                <w:szCs w:val="40"/>
+              </w:rPr>
+              <w:t>q</w:t>
+            </w:r>
+            <w:r>
+              <w:rPr>
+                <w:rFonts w:ascii="BRH Malayalam Extra" w:hAnsi="BRH Malayalam Extra" w:cs="BRH Malayalam Extra"/>
+                <w:color w:val="000000"/>
+                <w:sz w:val="40"/>
+                <w:szCs w:val="40"/>
+                <w:highlight w:val="green"/>
+              </w:rPr>
+              <w:t>Zx</w:t>
+            </w:r>
+            <w:r>
+              <w:rPr>
+                <w:rFonts w:ascii="BRH Malayalam Extra" w:hAnsi="BRH Malayalam Extra" w:cs="BRH Malayalam Extra"/>
+                <w:color w:val="000000"/>
+                <w:sz w:val="40"/>
+                <w:szCs w:val="40"/>
+              </w:rPr>
+              <w:t xml:space="preserve"> |</w:t>
+            </w:r>
+          </w:p>
+        </w:tc>
+      </w:tr>
+      <w:tr>
+        <w:trPr>
+          <w:trHeight w:val="1401"/>
+        </w:trPr>
+        <w:tc>
+          <w:tcPr>
+            <w:tcW w:w="3906" w:type="dxa"/>
+            <w:tcBorders>
+              <w:top w:val="single" w:sz="4" w:space="0" w:color="000000"/>
+              <w:left w:val="single" w:sz="4" w:space="0" w:color="000000"/>
+              <w:bottom w:val="single" w:sz="4" w:space="0" w:color="000000"/>
+              <w:right w:val="single" w:sz="4" w:space="0" w:color="000000"/>
+            </w:tcBorders>
+          </w:tcPr>
+          <w:p>
+            <w:pPr>
+              <w:widowControl w:val="0"/>
+              <w:tabs>
+                <w:tab w:val="left" w:pos="993"/>
+              </w:tabs>
+              <w:autoSpaceDE w:val="0"/>
+              <w:autoSpaceDN w:val="0"/>
+              <w:adjustRightInd w:val="0"/>
+              <w:spacing w:before="0" w:line="240" w:lineRule="auto"/>
+              <w:ind w:right="297"/>
+              <w:rPr>
+                <w:rFonts w:cs="Arial"/>
+                <w:b/>
+                <w:sz w:val="28"/>
+                <w:szCs w:val="32"/>
+              </w:rPr>
+            </w:pPr>
+            <w:r>
+              <w:rPr>
+                <w:rFonts w:cs="Arial"/>
+                <w:b/>
+                <w:sz w:val="28"/>
+                <w:szCs w:val="32"/>
+              </w:rPr>
+              <w:t>T.S.4.3.</w:t>
+            </w:r>
+            <w:r>
+              <w:rPr>
+                <w:rFonts w:cs="Arial"/>
+                <w:b/>
+                <w:sz w:val="28"/>
+                <w:szCs w:val="32"/>
+              </w:rPr>
+              <w:t>1</w:t>
+            </w:r>
+            <w:r>
+              <w:rPr>
+                <w:rFonts w:cs="Arial"/>
+                <w:b/>
+                <w:sz w:val="28"/>
+                <w:szCs w:val="32"/>
+              </w:rPr>
+              <w:t>1</w:t>
+            </w:r>
+            <w:r>
+              <w:rPr>
+                <w:rFonts w:cs="Arial"/>
+                <w:b/>
+                <w:sz w:val="28"/>
+                <w:szCs w:val="32"/>
+              </w:rPr>
+              <w:t>.</w:t>
+            </w:r>
+            <w:r>
+              <w:rPr>
+                <w:rFonts w:cs="Arial"/>
+                <w:b/>
+                <w:sz w:val="28"/>
+                <w:szCs w:val="32"/>
+              </w:rPr>
+              <w:t>5</w:t>
+            </w:r>
+            <w:r>
+              <w:rPr>
+                <w:rFonts w:cs="Arial"/>
+                <w:b/>
+                <w:sz w:val="28"/>
+                <w:szCs w:val="32"/>
+              </w:rPr>
+              <w:t xml:space="preserve"> – Kramam</w:t>
+            </w:r>
+          </w:p>
+          <w:p>
+            <w:pPr>
+              <w:widowControl w:val="0"/>
+              <w:tabs>
+                <w:tab w:val="left" w:pos="993"/>
+              </w:tabs>
+              <w:autoSpaceDE w:val="0"/>
+              <w:autoSpaceDN w:val="0"/>
+              <w:adjustRightInd w:val="0"/>
+              <w:spacing w:before="0" w:line="240" w:lineRule="auto"/>
+              <w:ind w:right="297"/>
+              <w:rPr>
+                <w:rFonts w:cs="Arial"/>
+                <w:b/>
+                <w:sz w:val="28"/>
+                <w:szCs w:val="32"/>
+                <w:lang w:val="it-IT"/>
+              </w:rPr>
+            </w:pPr>
+            <w:r>
+              <w:rPr>
+                <w:rFonts w:cs="Arial"/>
+                <w:b/>
+                <w:sz w:val="28"/>
+                <w:szCs w:val="32"/>
+                <w:lang w:val="it-IT"/>
+              </w:rPr>
+              <w:t xml:space="preserve">Krama Vaakyam No.– </w:t>
+            </w:r>
+            <w:r>
+              <w:rPr>
+                <w:rFonts w:cs="Arial"/>
+                <w:b/>
+                <w:sz w:val="28"/>
+                <w:szCs w:val="32"/>
+                <w:lang w:val="it-IT"/>
+              </w:rPr>
+              <w:t>31</w:t>
+            </w:r>
+          </w:p>
+          <w:p>
+            <w:pPr>
+              <w:widowControl w:val="0"/>
+              <w:tabs>
+                <w:tab w:val="left" w:pos="993"/>
+              </w:tabs>
+              <w:autoSpaceDE w:val="0"/>
+              <w:autoSpaceDN w:val="0"/>
+              <w:adjustRightInd w:val="0"/>
+              <w:spacing w:before="0" w:line="240" w:lineRule="auto"/>
+              <w:ind w:right="297"/>
+              <w:rPr>
+                <w:rFonts w:cs="Arial"/>
+                <w:b/>
+                <w:sz w:val="28"/>
+                <w:szCs w:val="32"/>
+                <w:lang w:val="it-IT"/>
+              </w:rPr>
+            </w:pPr>
+            <w:r>
+              <w:rPr>
+                <w:rFonts w:cs="Arial"/>
+                <w:b/>
+                <w:sz w:val="28"/>
+                <w:szCs w:val="32"/>
+                <w:lang w:val="it-IT"/>
+              </w:rPr>
+              <w:t>Panchaati No</w:t>
+            </w:r>
+            <w:r>
+              <w:rPr>
+                <w:rFonts w:cs="Arial"/>
+                <w:b/>
+                <w:szCs w:val="32"/>
+                <w:lang w:val="it-IT"/>
+              </w:rPr>
+              <w:t xml:space="preserve">. - </w:t>
+            </w:r>
+            <w:r>
+              <w:rPr>
+                <w:rFonts w:cs="Arial"/>
+                <w:b/>
+                <w:sz w:val="28"/>
+                <w:szCs w:val="32"/>
+                <w:lang w:val="it-IT"/>
+              </w:rPr>
+              <w:t>2</w:t>
+            </w:r>
+            <w:r>
+              <w:rPr>
+                <w:rFonts w:cs="Arial"/>
+                <w:b/>
+                <w:sz w:val="28"/>
+                <w:szCs w:val="32"/>
+                <w:lang w:val="it-IT"/>
+              </w:rPr>
+              <w:t>5</w:t>
+            </w:r>
+          </w:p>
+        </w:tc>
+        <w:tc>
+          <w:tcPr>
+            <w:tcW w:w="5103" w:type="dxa"/>
+            <w:tcBorders>
+              <w:top w:val="single" w:sz="4" w:space="0" w:color="000000"/>
+              <w:left w:val="single" w:sz="4" w:space="0" w:color="000000"/>
+              <w:bottom w:val="single" w:sz="4" w:space="0" w:color="000000"/>
+              <w:right w:val="single" w:sz="4" w:space="0" w:color="000000"/>
+            </w:tcBorders>
+          </w:tcPr>
+          <w:p>
+            <w:pPr>
+              <w:widowControl w:val="0"/>
+              <w:autoSpaceDE w:val="0"/>
+              <w:autoSpaceDN w:val="0"/>
+              <w:adjustRightInd w:val="0"/>
+              <w:spacing w:before="0" w:line="240" w:lineRule="auto"/>
+              <w:rPr>
+                <w:rFonts w:ascii="BRH Malayalam Extra" w:hAnsi="BRH Malayalam Extra" w:cs="BRH Malayalam Extra"/>
+                <w:color w:val="000000"/>
+                <w:sz w:val="40"/>
+                <w:szCs w:val="40"/>
+              </w:rPr>
+            </w:pPr>
+            <w:r>
+              <w:rPr>
+                <w:rFonts w:ascii="BRH Malayalam Extra" w:hAnsi="BRH Malayalam Extra" w:cs="BRH Malayalam Extra"/>
+                <w:color w:val="000000"/>
+                <w:sz w:val="40"/>
+                <w:szCs w:val="40"/>
+              </w:rPr>
+              <w:t xml:space="preserve">ej—sûZz </w:t>
+            </w:r>
+            <w:r>
+              <w:rPr>
+                <w:rFonts w:ascii="BRH Malayalam Extra" w:hAnsi="BRH Malayalam Extra" w:cs="BRH Malayalam Extra"/>
+                <w:color w:val="000000"/>
+                <w:sz w:val="40"/>
+                <w:szCs w:val="40"/>
+                <w:highlight w:val="yellow"/>
+              </w:rPr>
+              <w:t>c¡</w:t>
+            </w:r>
+            <w:r>
+              <w:rPr>
+                <w:rFonts w:ascii="BRH Malayalam Extra" w:hAnsi="BRH Malayalam Extra" w:cs="BRH Malayalam Extra"/>
+                <w:color w:val="000000"/>
+                <w:sz w:val="32"/>
+                <w:szCs w:val="40"/>
+              </w:rPr>
+              <w:t>–</w:t>
+            </w:r>
+            <w:r>
+              <w:rPr>
+                <w:rFonts w:ascii="BRH Malayalam Extra" w:hAnsi="BRH Malayalam Extra" w:cs="BRH Malayalam Extra"/>
+                <w:color w:val="000000"/>
+                <w:sz w:val="40"/>
+                <w:szCs w:val="40"/>
+              </w:rPr>
+              <w:t xml:space="preserve">±û | </w:t>
+            </w:r>
+          </w:p>
+          <w:p>
+            <w:pPr>
+              <w:widowControl w:val="0"/>
+              <w:autoSpaceDE w:val="0"/>
+              <w:autoSpaceDN w:val="0"/>
+              <w:adjustRightInd w:val="0"/>
+              <w:spacing w:before="0" w:line="240" w:lineRule="auto"/>
+              <w:rPr>
+                <w:rFonts w:ascii="BRH Malayalam Extra" w:hAnsi="BRH Malayalam Extra" w:cs="BRH Malayalam Extra"/>
+                <w:color w:val="000000"/>
+                <w:sz w:val="40"/>
+                <w:szCs w:val="40"/>
+              </w:rPr>
+            </w:pPr>
+            <w:r>
+              <w:rPr>
+                <w:rFonts w:ascii="BRH Malayalam Extra" w:hAnsi="BRH Malayalam Extra" w:cs="BRH Malayalam Extra"/>
+                <w:color w:val="000000"/>
+                <w:sz w:val="40"/>
+                <w:szCs w:val="40"/>
+              </w:rPr>
+              <w:t>c¡</w:t>
+            </w:r>
+            <w:r>
+              <w:rPr>
+                <w:rFonts w:ascii="BRH Malayalam Extra" w:hAnsi="BRH Malayalam Extra" w:cs="BRH Malayalam Extra"/>
+                <w:color w:val="000000"/>
+                <w:sz w:val="32"/>
+                <w:szCs w:val="40"/>
+              </w:rPr>
+              <w:t>–</w:t>
+            </w:r>
+            <w:r>
+              <w:rPr>
+                <w:rFonts w:ascii="BRH Malayalam Extra" w:hAnsi="BRH Malayalam Extra" w:cs="BRH Malayalam Extra"/>
+                <w:color w:val="000000"/>
+                <w:sz w:val="40"/>
+                <w:szCs w:val="40"/>
+              </w:rPr>
+              <w:t>¥±ûxÀ—kxi¡Àkx</w:t>
             </w:r>
             <w:r>
               <w:rPr>
@@ -654,9 +1526,20 @@
                 <w:sz w:val="40"/>
                 <w:szCs w:val="40"/>
               </w:rPr>
-              <w:t xml:space="preserve"> | </w:t>
-            </w:r>
-          </w:p>
+              <w:t xml:space="preserve"> |</w:t>
+            </w:r>
+          </w:p>
+        </w:tc>
+        <w:tc>
+          <w:tcPr>
+            <w:tcW w:w="5386" w:type="dxa"/>
+            <w:tcBorders>
+              <w:top w:val="single" w:sz="4" w:space="0" w:color="000000"/>
+              <w:left w:val="single" w:sz="4" w:space="0" w:color="000000"/>
+              <w:bottom w:val="single" w:sz="4" w:space="0" w:color="000000"/>
+              <w:right w:val="single" w:sz="4" w:space="0" w:color="000000"/>
+            </w:tcBorders>
+          </w:tcPr>
           <w:p>
             <w:pPr>
               <w:widowControl w:val="0"/>
@@ -678,61 +1561,68 @@
                 <w:sz w:val="40"/>
                 <w:szCs w:val="40"/>
               </w:rPr>
-              <w:t>¥K</w:t>
-            </w:r>
-            <w:r>
-              <w:rPr>
-                <w:rFonts w:ascii="BRH Malayalam Extra" w:hAnsi="BRH Malayalam Extra" w:cs="BRH Malayalam Extra"/>
-                <w:color w:val="000000"/>
-                <w:sz w:val="32"/>
-                <w:szCs w:val="40"/>
-              </w:rPr>
-              <w:t>–</w:t>
-            </w:r>
-            <w:r>
-              <w:rPr>
-                <w:rFonts w:ascii="BRH Malayalam Extra" w:hAnsi="BRH Malayalam Extra" w:cs="BRH Malayalam Extra"/>
-                <w:color w:val="000000"/>
-                <w:sz w:val="40"/>
-                <w:szCs w:val="40"/>
-              </w:rPr>
-              <w:t>Z¡</w:t>
-            </w:r>
-            <w:r>
-              <w:rPr>
-                <w:rFonts w:ascii="BRH Malayalam Extra" w:hAnsi="BRH Malayalam Extra" w:cs="BRH Malayalam Extra"/>
-                <w:color w:val="000000"/>
-                <w:sz w:val="40"/>
-                <w:szCs w:val="40"/>
-              </w:rPr>
-              <w:t>I</w:t>
-            </w:r>
-            <w:r>
-              <w:rPr>
-                <w:rFonts w:ascii="BRH Malayalam Extra" w:hAnsi="BRH Malayalam Extra" w:cs="BRH Malayalam Extra"/>
-                <w:color w:val="000000"/>
-                <w:sz w:val="40"/>
-                <w:szCs w:val="40"/>
-              </w:rPr>
-              <w:t xml:space="preserve"> öe—a</w:t>
-            </w:r>
-            <w:r>
-              <w:rPr>
-                <w:rFonts w:ascii="BRH Malayalam Extra" w:hAnsi="BRH Malayalam Extra" w:cs="BRH Malayalam Extra"/>
-                <w:color w:val="000000"/>
-                <w:sz w:val="32"/>
-                <w:szCs w:val="40"/>
-              </w:rPr>
-              <w:t>–</w:t>
-            </w:r>
-            <w:r>
-              <w:rPr>
-                <w:rFonts w:ascii="BRH Malayalam Extra" w:hAnsi="BRH Malayalam Extra" w:cs="BRH Malayalam Extra"/>
-                <w:color w:val="000000"/>
-                <w:sz w:val="40"/>
-                <w:szCs w:val="40"/>
-              </w:rPr>
-              <w:t>i</w:t>
+              <w:t xml:space="preserve">ej—sûZz </w:t>
+            </w:r>
+            <w:r>
+              <w:rPr>
+                <w:rFonts w:ascii="BRH Malayalam Extra" w:hAnsi="BRH Malayalam Extra" w:cs="BRH Malayalam Extra"/>
+                <w:color w:val="000000"/>
+                <w:sz w:val="40"/>
+                <w:szCs w:val="40"/>
+                <w:highlight w:val="green"/>
+              </w:rPr>
+              <w:t>c¡</w:t>
+            </w:r>
+            <w:r>
+              <w:rPr>
+                <w:rFonts w:ascii="BRH Malayalam Extra" w:hAnsi="BRH Malayalam Extra" w:cs="BRH Malayalam Extra"/>
+                <w:color w:val="000000"/>
+                <w:sz w:val="40"/>
+                <w:szCs w:val="40"/>
+              </w:rPr>
+              <w:t xml:space="preserve">±û | </w:t>
+            </w:r>
+          </w:p>
+          <w:p>
+            <w:pPr>
+              <w:widowControl w:val="0"/>
+              <w:autoSpaceDE w:val="0"/>
+              <w:autoSpaceDN w:val="0"/>
+              <w:adjustRightInd w:val="0"/>
+              <w:spacing w:before="0" w:line="240" w:lineRule="auto"/>
+              <w:rPr>
+                <w:rFonts w:ascii="BRH Malayalam Extra" w:hAnsi="BRH Malayalam Extra" w:cs="BRH Malayalam Extra"/>
+                <w:color w:val="000000"/>
+                <w:sz w:val="40"/>
+                <w:szCs w:val="40"/>
+              </w:rPr>
+            </w:pPr>
+            <w:r>
+              <w:rPr>
+                <w:rFonts w:ascii="BRH Malayalam Extra" w:hAnsi="BRH Malayalam Extra" w:cs="BRH Malayalam Extra"/>
+                <w:color w:val="000000"/>
+                <w:sz w:val="40"/>
+                <w:szCs w:val="40"/>
+              </w:rPr>
+              <w:t>c¡</w:t>
+            </w:r>
+            <w:r>
+              <w:rPr>
+                <w:rFonts w:ascii="BRH Malayalam Extra" w:hAnsi="BRH Malayalam Extra" w:cs="BRH Malayalam Extra"/>
+                <w:color w:val="000000"/>
+                <w:sz w:val="32"/>
+                <w:szCs w:val="40"/>
+              </w:rPr>
+              <w:t>–</w:t>
+            </w:r>
+            <w:r>
+              <w:rPr>
+                <w:rFonts w:ascii="BRH Malayalam Extra" w:hAnsi="BRH Malayalam Extra" w:cs="BRH Malayalam Extra"/>
+                <w:color w:val="000000"/>
+                <w:sz w:val="40"/>
+                <w:szCs w:val="40"/>
+              </w:rPr>
+              <w:t>¥±ûxÀ—kxi¡Àkx</w:t>
             </w:r>
             <w:r>
               <w:rPr>
@@ -1049,6 +1939,7 @@
                 <w:sz w:val="28"/>
                 <w:szCs w:val="32"/>
               </w:rPr>
+              <w:lastRenderedPageBreak/>
               <w:t>T.S.4.3.</w:t>
             </w:r>
             <w:r>
@@ -1693,7 +2584,6 @@
                 <w:sz w:val="28"/>
                 <w:szCs w:val="32"/>
               </w:rPr>
-              <w:lastRenderedPageBreak/>
               <w:t>T.S.4.3.</w:t>
             </w:r>
             <w:r>
@@ -2771,6 +3661,7 @@
                 <w:sz w:val="28"/>
                 <w:szCs w:val="32"/>
               </w:rPr>
+              <w:lastRenderedPageBreak/>
               <w:t>T.S.4.3.1.1 – Kramam</w:t>
             </w:r>
           </w:p>
@@ -3268,7 +4159,6 @@
                 <w:sz w:val="28"/>
                 <w:szCs w:val="32"/>
               </w:rPr>
-              <w:lastRenderedPageBreak/>
               <w:t>T.S.4.3.4.2 – Kramam</w:t>
             </w:r>
           </w:p>
@@ -5074,6 +5964,7 @@
                 <w:sz w:val="28"/>
                 <w:szCs w:val="32"/>
               </w:rPr>
+              <w:lastRenderedPageBreak/>
               <w:t>T.S.4.3.9.2 – Kramam</w:t>
             </w:r>
           </w:p>
@@ -5842,7 +6733,6 @@
                 <w:sz w:val="28"/>
                 <w:szCs w:val="32"/>
               </w:rPr>
-              <w:lastRenderedPageBreak/>
               <w:t>T.S.4.3.</w:t>
             </w:r>
             <w:r>
@@ -7893,6 +8783,7 @@
                 <w:sz w:val="28"/>
                 <w:szCs w:val="32"/>
               </w:rPr>
+              <w:lastRenderedPageBreak/>
               <w:t>T.S.4.3.12.2 – Kramam</w:t>
             </w:r>
           </w:p>
@@ -8455,7 +9346,6 @@
                 <w:sz w:val="28"/>
                 <w:szCs w:val="32"/>
               </w:rPr>
-              <w:lastRenderedPageBreak/>
               <w:t>T.S.4.3.13.12 – Kramam</w:t>
             </w:r>
           </w:p>
@@ -10223,6 +11113,7 @@
                 <w:sz w:val="28"/>
                 <w:szCs w:val="32"/>
               </w:rPr>
+              <w:lastRenderedPageBreak/>
               <w:t>T.S.4.3.13.8 – Kramam</w:t>
             </w:r>
           </w:p>
@@ -10486,7 +11377,16 @@
           <w:bCs/>
           <w:sz w:val="32"/>
         </w:rPr>
-        <w:t>replaced with</w:t>
+        <w:t xml:space="preserve">replaced </w:t>
+      </w:r>
+      <w:proofErr w:type="gramStart"/>
+      <w:r>
+        <w:rPr>
+          <w:b/>
+          <w:bCs/>
+          <w:sz w:val="32"/>
+        </w:rPr>
+        <w:t>with</w:t>
       </w:r>
       <w:r>
         <w:rPr>
@@ -10508,6 +11408,7 @@
         </w:rPr>
         <w:t>"</w:t>
       </w:r>
+      <w:proofErr w:type="gramEnd"/>
       <w:r>
         <w:rPr>
           <w:rFonts w:ascii="BRH Malayalam" w:hAnsi="BRH Malayalam" w:cs="BRH Malayalam"/>
@@ -10519,6 +11420,7 @@
         </w:rPr>
         <w:t>q§T</w:t>
       </w:r>
+      <w:proofErr w:type="gramStart"/>
       <w:r>
         <w:rPr>
           <w:rFonts w:ascii="BRH Malayalam" w:hAnsi="BRH Malayalam" w:cs="BRH Malayalam"/>
@@ -10535,7 +11437,16 @@
           <w:bCs/>
           <w:sz w:val="32"/>
         </w:rPr>
-        <w:t>wherever applicable</w:t>
+        <w:t>wherever</w:t>
+      </w:r>
+      <w:proofErr w:type="gramEnd"/>
+      <w:r>
+        <w:rPr>
+          <w:b/>
+          <w:bCs/>
+          <w:sz w:val="32"/>
+        </w:rPr>
+        <w:t xml:space="preserve"> applicable</w:t>
       </w:r>
     </w:p>
     <w:p>
@@ -10591,7 +11502,6 @@
           <w:szCs w:val="32"/>
           <w:u w:val="single"/>
         </w:rPr>
-        <w:lastRenderedPageBreak/>
         <w:t xml:space="preserve">TS </w:t>
       </w:r>
       <w:r>

</xml_diff>